<commit_message>
Implementation  - MarketStructureIndicator articles/23049  - Francis Nyoike Thumbi    + Trendline Discovery and Lifecycle Management    + Trading Supply and Demand Zones
</commit_message>
<xml_diff>
--- a/Experts/Anhnt/Document/MQL5 Note/2026 1009 Trading rà soát.docx
+++ b/Experts/Anhnt/Document/MQL5 Note/2026 1009 Trading rà soát.docx
@@ -1533,6 +1533,709 @@
         <w:t>Việc tra đơn theo ticket hay PEND_REQ_ID trong CTrading/TradingControl thì đặt vòng lặp ở đâu? CTrading V2 đã có GetOrderObjByTicket và IsPresentOrderByID, có thể tái dùng. Chuyện này để lúc port CTrading, chưa cần chốt bây giờ.</w:t>
       </w:r>
     </w:p>
+    <w:p>
+      <w:pPr>
+        <w:pStyle w:val="Heading1"/>
+      </w:pPr>
+      <w:r>
+        <w:t>Còn treo</w:t>
+      </w:r>
+    </w:p>
+    <w:p>
+      <w:r>
+        <w:rPr>
+          <w:b/>
+          <w:bCs/>
+        </w:rPr>
+        <w:t>Còn treo</w:t>
+      </w:r>
+    </w:p>
+    <w:p>
+      <w:pPr>
+        <w:numPr>
+          <w:ilvl w:val="0"/>
+          <w:numId w:val="12"/>
+        </w:numPr>
+      </w:pPr>
+      <w:hyperlink r:id="rId6" w:anchor="L174" w:tgtFrame="_blank" w:history="1">
+        <w:r>
+          <w:rPr>
+            <w:rStyle w:val="Hyperlink"/>
+          </w:rPr>
+          <w:t>MarketCollection.mqh:174</w:t>
+        </w:r>
+      </w:hyperlink>
+      <w:r>
+        <w:t> vẫn có MSG_LIB_SYS_FAILED_ADD_CTRL_ORDER_TO... (dấu ba chấm thật trong code). Lỗi này lặp lại ở lượt compile sau. Tớ vẫn chưa sửa vì cậu chưa trả lời. Cậu cho tớ sửa thành ..._TO_LIST luôn không?</w:t>
+      </w:r>
+    </w:p>
+    <w:p>
+      <w:pPr>
+        <w:numPr>
+          <w:ilvl w:val="0"/>
+          <w:numId w:val="12"/>
+        </w:numPr>
+      </w:pPr>
+      <w:r>
+        <w:t>Câu hỏi MarketCollection: giữ các hàm đã viết lại hay xoá các hàm chưa ai gọi.</w:t>
+      </w:r>
+    </w:p>
+    <w:p>
+      <w:pPr>
+        <w:numPr>
+          <w:ilvl w:val="0"/>
+          <w:numId w:val="12"/>
+        </w:numPr>
+      </w:pPr>
+      <w:r>
+        <w:t>Ba overload GetList(ORDER_PROP_*) vừa xoá ở cả Market và History sẽ lỗi ở TradingControl (6 chỗ) khi ta port nó.</w:t>
+      </w:r>
+    </w:p>
+    <w:p>
+      <w:pPr>
+        <w:pStyle w:val="Heading1"/>
+      </w:pPr>
+      <w:r>
+        <w:lastRenderedPageBreak/>
+        <w:t>Quay lại với Ctrading, Tradingengine</w:t>
+      </w:r>
+    </w:p>
+    <w:p>
+      <w:r>
+        <w:t xml:space="preserve">ở V3 ta chỉ </w:t>
+      </w:r>
+      <w:r>
+        <w:rPr>
+          <w:b/>
+          <w:bCs/>
+        </w:rPr>
+        <w:t>thay đổi những chỗ cách tính đổi</w:t>
+      </w:r>
+      <w:r>
+        <w:t>, phần còn lại port gần như nguyên văn. Sau khi các collection xong, tình hình bốn class:</w:t>
+      </w:r>
+    </w:p>
+    <w:tbl>
+      <w:tblPr>
+        <w:tblW w:w="0" w:type="auto"/>
+        <w:shd w:val="clear" w:color="auto" w:fill="F3F3F3"/>
+        <w:tblCellMar>
+          <w:top w:w="15" w:type="dxa"/>
+          <w:left w:w="15" w:type="dxa"/>
+          <w:bottom w:w="15" w:type="dxa"/>
+          <w:right w:w="15" w:type="dxa"/>
+        </w:tblCellMar>
+        <w:tblLook w:val="04A0" w:firstRow="1" w:lastRow="0" w:firstColumn="1" w:lastColumn="0" w:noHBand="0" w:noVBand="1"/>
+      </w:tblPr>
+      <w:tblGrid>
+        <w:gridCol w:w="2700"/>
+        <w:gridCol w:w="5719"/>
+        <w:gridCol w:w="941"/>
+      </w:tblGrid>
+      <w:tr>
+        <w:trPr>
+          <w:tblHeader/>
+        </w:trPr>
+        <w:tc>
+          <w:tcPr>
+            <w:tcW w:w="0" w:type="auto"/>
+            <w:shd w:val="clear" w:color="auto" w:fill="F3F3F3"/>
+            <w:tcMar>
+              <w:top w:w="30" w:type="dxa"/>
+              <w:left w:w="30" w:type="dxa"/>
+              <w:bottom w:w="30" w:type="dxa"/>
+              <w:right w:w="30" w:type="dxa"/>
+            </w:tcMar>
+            <w:vAlign w:val="center"/>
+            <w:hideMark/>
+          </w:tcPr>
+          <w:p>
+            <w:pPr>
+              <w:rPr>
+                <w:b/>
+                <w:bCs/>
+              </w:rPr>
+            </w:pPr>
+            <w:r>
+              <w:rPr>
+                <w:b/>
+                <w:bCs/>
+              </w:rPr>
+              <w:t>Class</w:t>
+            </w:r>
+          </w:p>
+        </w:tc>
+        <w:tc>
+          <w:tcPr>
+            <w:tcW w:w="0" w:type="auto"/>
+            <w:shd w:val="clear" w:color="auto" w:fill="F3F3F3"/>
+            <w:tcMar>
+              <w:top w:w="30" w:type="dxa"/>
+              <w:left w:w="30" w:type="dxa"/>
+              <w:bottom w:w="30" w:type="dxa"/>
+              <w:right w:w="30" w:type="dxa"/>
+            </w:tcMar>
+            <w:vAlign w:val="center"/>
+            <w:hideMark/>
+          </w:tcPr>
+          <w:p>
+            <w:pPr>
+              <w:rPr>
+                <w:b/>
+                <w:bCs/>
+              </w:rPr>
+            </w:pPr>
+            <w:r>
+              <w:rPr>
+                <w:b/>
+                <w:bCs/>
+              </w:rPr>
+              <w:t>Thay đổi V2 → V3</w:t>
+            </w:r>
+          </w:p>
+        </w:tc>
+        <w:tc>
+          <w:tcPr>
+            <w:tcW w:w="0" w:type="auto"/>
+            <w:shd w:val="clear" w:color="auto" w:fill="F3F3F3"/>
+            <w:tcMar>
+              <w:top w:w="30" w:type="dxa"/>
+              <w:left w:w="30" w:type="dxa"/>
+              <w:bottom w:w="30" w:type="dxa"/>
+              <w:right w:w="30" w:type="dxa"/>
+            </w:tcMar>
+            <w:vAlign w:val="center"/>
+            <w:hideMark/>
+          </w:tcPr>
+          <w:p>
+            <w:pPr>
+              <w:rPr>
+                <w:b/>
+                <w:bCs/>
+              </w:rPr>
+            </w:pPr>
+            <w:r>
+              <w:rPr>
+                <w:b/>
+                <w:bCs/>
+              </w:rPr>
+              <w:t>Khối lượng</w:t>
+            </w:r>
+          </w:p>
+        </w:tc>
+      </w:tr>
+      <w:tr>
+        <w:tc>
+          <w:tcPr>
+            <w:tcW w:w="0" w:type="auto"/>
+            <w:shd w:val="clear" w:color="auto" w:fill="F3F3F3"/>
+            <w:tcMar>
+              <w:top w:w="30" w:type="dxa"/>
+              <w:left w:w="30" w:type="dxa"/>
+              <w:bottom w:w="30" w:type="dxa"/>
+              <w:right w:w="30" w:type="dxa"/>
+            </w:tcMar>
+            <w:vAlign w:val="center"/>
+            <w:hideMark/>
+          </w:tcPr>
+          <w:p>
+            <w:r>
+              <w:rPr>
+                <w:b/>
+                <w:bCs/>
+              </w:rPr>
+              <w:t>CTrading</w:t>
+            </w:r>
+          </w:p>
+        </w:tc>
+        <w:tc>
+          <w:tcPr>
+            <w:tcW w:w="0" w:type="auto"/>
+            <w:shd w:val="clear" w:color="auto" w:fill="F3F3F3"/>
+            <w:tcMar>
+              <w:top w:w="30" w:type="dxa"/>
+              <w:left w:w="30" w:type="dxa"/>
+              <w:bottom w:w="30" w:type="dxa"/>
+              <w:right w:w="30" w:type="dxa"/>
+            </w:tcMar>
+            <w:vAlign w:val="center"/>
+            <w:hideMark/>
+          </w:tcPr>
+          <w:p>
+            <w:r>
+              <w:t>Không đổi logic. Chỉ bỏ Select: 27 chỗ CTradingSelect nằm trong các hàm đếm và tra cứu (xem dưới). Thêm ~60 message vào MessageData.mqh (bằng script có sẵn) và define TOTAL_TRADE_TRY.</w:t>
+            </w:r>
+          </w:p>
+        </w:tc>
+        <w:tc>
+          <w:tcPr>
+            <w:tcW w:w="0" w:type="auto"/>
+            <w:shd w:val="clear" w:color="auto" w:fill="F3F3F3"/>
+            <w:tcMar>
+              <w:top w:w="30" w:type="dxa"/>
+              <w:left w:w="30" w:type="dxa"/>
+              <w:bottom w:w="30" w:type="dxa"/>
+              <w:right w:w="30" w:type="dxa"/>
+            </w:tcMar>
+            <w:vAlign w:val="center"/>
+            <w:hideMark/>
+          </w:tcPr>
+          <w:p>
+            <w:r>
+              <w:t>Lớn (4448 dòng) nhưng cơ học</w:t>
+            </w:r>
+          </w:p>
+        </w:tc>
+      </w:tr>
+      <w:tr>
+        <w:tc>
+          <w:tcPr>
+            <w:tcW w:w="0" w:type="auto"/>
+            <w:shd w:val="clear" w:color="auto" w:fill="F3F3F3"/>
+            <w:tcMar>
+              <w:top w:w="30" w:type="dxa"/>
+              <w:left w:w="30" w:type="dxa"/>
+              <w:bottom w:w="30" w:type="dxa"/>
+              <w:right w:w="30" w:type="dxa"/>
+            </w:tcMar>
+            <w:vAlign w:val="center"/>
+            <w:hideMark/>
+          </w:tcPr>
+          <w:p>
+            <w:r>
+              <w:rPr>
+                <w:b/>
+                <w:bCs/>
+              </w:rPr>
+              <w:t>CTradingControl</w:t>
+            </w:r>
+          </w:p>
+        </w:tc>
+        <w:tc>
+          <w:tcPr>
+            <w:tcW w:w="0" w:type="auto"/>
+            <w:shd w:val="clear" w:color="auto" w:fill="F3F3F3"/>
+            <w:tcMar>
+              <w:top w:w="30" w:type="dxa"/>
+              <w:left w:w="30" w:type="dxa"/>
+              <w:bottom w:w="30" w:type="dxa"/>
+              <w:right w:w="30" w:type="dxa"/>
+            </w:tcMar>
+            <w:vAlign w:val="center"/>
+            <w:hideMark/>
+          </w:tcPr>
+          <w:p>
+            <w:r>
+              <w:t>Không đổi logic. 1 chỗ Select (dòng 455) cộng 6 chỗ m_market.GetList(ORDER_PROP_*) và 1 chỗ m_history_collection.GetList(...) mà ta vừa xoá hàm. Thêm ~11 message.</w:t>
+            </w:r>
+          </w:p>
+        </w:tc>
+        <w:tc>
+          <w:tcPr>
+            <w:tcW w:w="0" w:type="auto"/>
+            <w:shd w:val="clear" w:color="auto" w:fill="F3F3F3"/>
+            <w:tcMar>
+              <w:top w:w="30" w:type="dxa"/>
+              <w:left w:w="30" w:type="dxa"/>
+              <w:bottom w:w="30" w:type="dxa"/>
+              <w:right w:w="30" w:type="dxa"/>
+            </w:tcMar>
+            <w:vAlign w:val="center"/>
+            <w:hideMark/>
+          </w:tcPr>
+          <w:p>
+            <w:r>
+              <w:t>Vừa (1377 dòng)</w:t>
+            </w:r>
+          </w:p>
+        </w:tc>
+      </w:tr>
+      <w:tr>
+        <w:tc>
+          <w:tcPr>
+            <w:tcW w:w="0" w:type="auto"/>
+            <w:shd w:val="clear" w:color="auto" w:fill="F3F3F3"/>
+            <w:tcMar>
+              <w:top w:w="30" w:type="dxa"/>
+              <w:left w:w="30" w:type="dxa"/>
+              <w:bottom w:w="30" w:type="dxa"/>
+              <w:right w:w="30" w:type="dxa"/>
+            </w:tcMar>
+            <w:vAlign w:val="center"/>
+            <w:hideMark/>
+          </w:tcPr>
+          <w:p>
+            <w:r>
+              <w:rPr>
+                <w:b/>
+                <w:bCs/>
+              </w:rPr>
+              <w:t>CTradeEventsCollection</w:t>
+            </w:r>
+          </w:p>
+        </w:tc>
+        <w:tc>
+          <w:tcPr>
+            <w:tcW w:w="0" w:type="auto"/>
+            <w:shd w:val="clear" w:color="auto" w:fill="F3F3F3"/>
+            <w:tcMar>
+              <w:top w:w="30" w:type="dxa"/>
+              <w:left w:w="30" w:type="dxa"/>
+              <w:bottom w:w="30" w:type="dxa"/>
+              <w:right w:w="30" w:type="dxa"/>
+            </w:tcMar>
+            <w:vAlign w:val="center"/>
+            <w:hideMark/>
+          </w:tcPr>
+          <w:p>
+            <w:r>
+              <w:t>Đã xong phần dọn giấy nháp, giữ mọi sự kiện. Chờ compile.</w:t>
+            </w:r>
+          </w:p>
+        </w:tc>
+        <w:tc>
+          <w:tcPr>
+            <w:tcW w:w="0" w:type="auto"/>
+            <w:shd w:val="clear" w:color="auto" w:fill="F3F3F3"/>
+            <w:tcMar>
+              <w:top w:w="30" w:type="dxa"/>
+              <w:left w:w="30" w:type="dxa"/>
+              <w:bottom w:w="30" w:type="dxa"/>
+              <w:right w:w="30" w:type="dxa"/>
+            </w:tcMar>
+            <w:vAlign w:val="center"/>
+            <w:hideMark/>
+          </w:tcPr>
+          <w:p>
+            <w:r>
+              <w:t>Xong</w:t>
+            </w:r>
+          </w:p>
+        </w:tc>
+      </w:tr>
+      <w:tr>
+        <w:tc>
+          <w:tcPr>
+            <w:tcW w:w="0" w:type="auto"/>
+            <w:shd w:val="clear" w:color="auto" w:fill="F3F3F3"/>
+            <w:tcMar>
+              <w:top w:w="30" w:type="dxa"/>
+              <w:left w:w="30" w:type="dxa"/>
+              <w:bottom w:w="30" w:type="dxa"/>
+              <w:right w:w="30" w:type="dxa"/>
+            </w:tcMar>
+            <w:vAlign w:val="center"/>
+            <w:hideMark/>
+          </w:tcPr>
+          <w:p>
+            <w:r>
+              <w:rPr>
+                <w:b/>
+                <w:bCs/>
+              </w:rPr>
+              <w:t>CTradingEngine</w:t>
+            </w:r>
+          </w:p>
+        </w:tc>
+        <w:tc>
+          <w:tcPr>
+            <w:tcW w:w="0" w:type="auto"/>
+            <w:shd w:val="clear" w:color="auto" w:fill="F3F3F3"/>
+            <w:tcMar>
+              <w:top w:w="30" w:type="dxa"/>
+              <w:left w:w="30" w:type="dxa"/>
+              <w:bottom w:w="30" w:type="dxa"/>
+              <w:right w:w="30" w:type="dxa"/>
+            </w:tcMar>
+            <w:vAlign w:val="center"/>
+            <w:hideMark/>
+          </w:tcPr>
+          <w:p>
+            <w:r>
+              <w:t>Đây là chỗ thật sự đổi: giá trị indicator của SL/Trailing lấy từ Python; phần còn lại (điều phối, lot theo rủi ro, chọn ứng viên SL) giữ native.</w:t>
+            </w:r>
+          </w:p>
+        </w:tc>
+        <w:tc>
+          <w:tcPr>
+            <w:tcW w:w="0" w:type="auto"/>
+            <w:shd w:val="clear" w:color="auto" w:fill="F3F3F3"/>
+            <w:tcMar>
+              <w:top w:w="30" w:type="dxa"/>
+              <w:left w:w="30" w:type="dxa"/>
+              <w:bottom w:w="30" w:type="dxa"/>
+              <w:right w:w="30" w:type="dxa"/>
+            </w:tcMar>
+            <w:vAlign w:val="center"/>
+            <w:hideMark/>
+          </w:tcPr>
+          <w:p>
+            <w:r>
+              <w:t>Cần thiết kế, 3 câu hỏi cũ còn mở</w:t>
+            </w:r>
+          </w:p>
+        </w:tc>
+      </w:tr>
+    </w:tbl>
+    <w:p>
+      <w:r>
+        <w:rPr>
+          <w:b/>
+          <w:bCs/>
+        </w:rPr>
+        <w:t>Các chỗ Select trong CTrading</w:t>
+      </w:r>
+      <w:r>
+        <w:t xml:space="preserve"> (đều là hàm nội bộ, thay bằng vòng lặp trên MarketCollection.GetList()):</w:t>
+      </w:r>
+    </w:p>
+    <w:p>
+      <w:pPr>
+        <w:numPr>
+          <w:ilvl w:val="0"/>
+          <w:numId w:val="13"/>
+        </w:numPr>
+      </w:pPr>
+      <w:r>
+        <w:t>Đếm Position/Pending theo hướng và tổng volume: PositionsTotalAll/Long/Short, OrdersTotalAll/Long/Short, PositionsTotalVolumeLong/Short, OrdersTotalVolumeLong/Short (dòng 1595–1715, 17 chỗ).</w:t>
+      </w:r>
+    </w:p>
+    <w:p>
+      <w:pPr>
+        <w:numPr>
+          <w:ilvl w:val="0"/>
+          <w:numId w:val="13"/>
+        </w:numPr>
+      </w:pPr>
+      <w:r>
+        <w:t>Tra theo ticket: GetOrderObjByTicket, CheckPositionAvailablity, CheckOrderAvailablity (dòng 1753–1954, khoảng 10 chỗ).</w:t>
+      </w:r>
+    </w:p>
+    <w:p>
+      <w:r>
+        <w:rPr>
+          <w:b/>
+          <w:bCs/>
+        </w:rPr>
+        <w:t>Một điểm hay</w:t>
+      </w:r>
+      <w:r>
+        <w:t xml:space="preserve">: GetOrderObjByTicket của CTrading tra đúng một Order theo ticket. Sáu chỗ GetList(ORDER_PROP_TICKET, ...) trong CTradingControl cũng chỉ cần việc đó, nên ta dùng lại hàm này, không thêm hàm mới. Còn lại là GetList(ORDER_PROP_PEND_REQ_ID, ...) (hai </w:t>
+      </w:r>
+      <w:r>
+        <w:lastRenderedPageBreak/>
+        <w:t>chỗ: Trading.mqh:4391 và TradingControl.mqh:319), tra theo ID của pending request, cần một vòng lặp tương tự.</w:t>
+      </w:r>
+    </w:p>
+    <w:p>
+      <w:r>
+        <w:rPr>
+          <w:b/>
+          <w:bCs/>
+        </w:rPr>
+        <w:t>Đề xuất thứ tự</w:t>
+      </w:r>
+    </w:p>
+    <w:p>
+      <w:pPr>
+        <w:numPr>
+          <w:ilvl w:val="0"/>
+          <w:numId w:val="14"/>
+        </w:numPr>
+      </w:pPr>
+      <w:r>
+        <w:t>Port CTrading: chạy script message, thêm TOTAL_TRADE_TRY, copy file, thay Select bằng vòng lặp.</w:t>
+      </w:r>
+    </w:p>
+    <w:p>
+      <w:pPr>
+        <w:numPr>
+          <w:ilvl w:val="0"/>
+          <w:numId w:val="14"/>
+        </w:numPr>
+      </w:pPr>
+      <w:r>
+        <w:t>Port CTradingControl, dùng lại GetOrderObjByTicket.</w:t>
+      </w:r>
+    </w:p>
+    <w:p>
+      <w:pPr>
+        <w:numPr>
+          <w:ilvl w:val="0"/>
+          <w:numId w:val="14"/>
+        </w:numPr>
+      </w:pPr>
+      <w:r>
+        <w:t>Thiết kế CTradingEngine V3 khi cậu trả lời ba câu hỏi: ATR lấy từ đâu, magic number mỗi EA, nến M1 của Trailing Fixed.</w:t>
+      </w:r>
+    </w:p>
+    <w:p>
+      <w:pPr>
+        <w:pStyle w:val="Heading2"/>
+      </w:pPr>
+      <w:r>
+        <w:t>Ctrading</w:t>
+      </w:r>
+    </w:p>
+    <w:p>
+      <w:r>
+        <w:t>Trading.mqh. Tớ báo kết quả.</w:t>
+      </w:r>
+    </w:p>
+    <w:p>
+      <w:r>
+        <w:rPr>
+          <w:b/>
+          <w:bCs/>
+        </w:rPr>
+        <w:t>Nguyên nhân lỗi wrong parameters count, 3 passed, but 0 requires</w:t>
+      </w:r>
+      <w:r>
+        <w:t xml:space="preserve"> (</w:t>
+      </w:r>
+      <w:hyperlink r:id="rId7" w:anchor="L4391" w:tgtFrame="_blank" w:history="1">
+        <w:r>
+          <w:rPr>
+            <w:rStyle w:val="Hyperlink"/>
+          </w:rPr>
+          <w:t>Trading.mqh:4391</w:t>
+        </w:r>
+      </w:hyperlink>
+      <w:r>
+        <w:t>): IsPresentOrderByID gọi this.m_market.GetList(ORDER_PROP_PEND_REQ_ID, id, EQUAL), nhưng ba overload GetList(property, value, mode) của MarketCollection đã bị tớ xoá (giấy nháp). Chỉ còn GetList() không tham số, nên báo "cần 0 tham số, truyền vào 3".</w:t>
+      </w:r>
+    </w:p>
+    <w:p>
+      <w:r>
+        <w:rPr>
+          <w:b/>
+          <w:bCs/>
+        </w:rPr>
+        <w:t xml:space="preserve">Đã sửa trong </w:t>
+      </w:r>
+      <w:hyperlink r:id="rId8" w:tgtFrame="_blank" w:history="1">
+        <w:r>
+          <w:rPr>
+            <w:rStyle w:val="Hyperlink"/>
+            <w:b/>
+            <w:bCs/>
+          </w:rPr>
+          <w:t>Trading.mqh</w:t>
+        </w:r>
+      </w:hyperlink>
+      <w:r>
+        <w:rPr>
+          <w:b/>
+          <w:bCs/>
+        </w:rPr>
+        <w:t>, không còn Select</w:t>
+      </w:r>
+    </w:p>
+    <w:p>
+      <w:pPr>
+        <w:numPr>
+          <w:ilvl w:val="0"/>
+          <w:numId w:val="15"/>
+        </w:numPr>
+      </w:pPr>
+      <w:r>
+        <w:t>IsPresentOrderByID: vòng lặp, kiểm tra order.PendReqID()==id.</w:t>
+      </w:r>
+    </w:p>
+    <w:p>
+      <w:pPr>
+        <w:numPr>
+          <w:ilvl w:val="0"/>
+          <w:numId w:val="15"/>
+        </w:numPr>
+      </w:pPr>
+      <w:r>
+        <w:t>Chín hàm đếm và cộng volume (PositionsTotalAll/Long/Short, OrdersTotalAll/Long/Short, PositionsTotalVolumeLong/Short, OrdersTotalVolumeLong/Short): vòng lặp. Với Position tớ gọi lại m_market.HasPosition(order, "", POSITION_TYPE_BUY/SELL) (hàm vừa viết ở MarketCollection), nên không phải thêm hàm mới. Với Pending thì viết thẳng điều kiện trạng thái và TypeByDirection().</w:t>
+      </w:r>
+    </w:p>
+    <w:p>
+      <w:pPr>
+        <w:numPr>
+          <w:ilvl w:val="0"/>
+          <w:numId w:val="15"/>
+        </w:numPr>
+      </w:pPr>
+      <w:r>
+        <w:t>GetSymbolObjByPosition, GetSymbolObjByOrder: tìm theo ticket bằng vòng lặp. Giữ nguyên các thông báo "không có Position/Order nào" và "không có ticket đó". Hai nhánh "không lấy được list" (không thể xảy ra nữa) đã bỏ.</w:t>
+      </w:r>
+    </w:p>
+    <w:p>
+      <w:pPr>
+        <w:numPr>
+          <w:ilvl w:val="0"/>
+          <w:numId w:val="15"/>
+        </w:numPr>
+      </w:pPr>
+      <w:r>
+        <w:t>GetOrderObjByTicket, CheckPositionAvailablity, CheckOrderAvailablity: vòng lặp. Dòng list.Sort(SORT_BY_ORDER_TICKET) bỏ vì không cần nữa.</w:t>
+      </w:r>
+    </w:p>
+    <w:p>
+      <w:r>
+        <w:t>Trong Trading.mqh và TradingControl.mqh hiện không còn CTradingSelect hay TradingListStorage. Tớ chưa kiểm tra bản TradingControl.mqh của V3: file đó vẫn là bản UTF-16 cũ cậu chưa sửa (ngày 5/10), nên chưa biết nó có còn gọi GetList(ORDER_PROP_*) hay không. Khi cậu chuyển sang UTF-8 thì báo tớ.</w:t>
+      </w:r>
+    </w:p>
+    <w:p>
+      <w:r>
+        <w:rPr>
+          <w:b/>
+          <w:bCs/>
+        </w:rPr>
+        <w:lastRenderedPageBreak/>
+        <w:t>Đã bổ sung kèm theo</w:t>
+      </w:r>
+    </w:p>
+    <w:p>
+      <w:pPr>
+        <w:numPr>
+          <w:ilvl w:val="0"/>
+          <w:numId w:val="16"/>
+        </w:numPr>
+      </w:pPr>
+      <w:r>
+        <w:t>MessageData.mqh: thêm </w:t>
+      </w:r>
+      <w:r>
+        <w:rPr>
+          <w:b/>
+          <w:bCs/>
+        </w:rPr>
+        <w:t>55 message</w:t>
+      </w:r>
+      <w:r>
+        <w:t> mà Trading.mqh và TradingControl.mqh dùng (lần chạy lại báo missing to add 0).</w:t>
+      </w:r>
+    </w:p>
+    <w:p>
+      <w:pPr>
+        <w:numPr>
+          <w:ilvl w:val="0"/>
+          <w:numId w:val="16"/>
+        </w:numPr>
+      </w:pPr>
+      <w:r>
+        <w:t>CommonDefines.mqh dòng 31: TOTAL_TRADE_TRY (5), lấy từ V2.</w:t>
+      </w:r>
+    </w:p>
+    <w:p>
+      <w:pPr>
+        <w:pStyle w:val="Heading2"/>
+      </w:pPr>
+      <w:r>
+        <w:t>C</w:t>
+      </w:r>
+      <w:r>
+        <w:t>t</w:t>
+      </w:r>
+      <w:r>
+        <w:t>radingControl</w:t>
+      </w:r>
+    </w:p>
     <w:p/>
     <w:sectPr>
       <w:pgSz w:w="12240" w:h="15840"/>
@@ -1660,6 +2363,155 @@
     </w:lvl>
   </w:abstractNum>
   <w:abstractNum w:abstractNumId="1" w15:restartNumberingAfterBreak="0">
+    <w:nsid w:val="065B7260"/>
+    <w:multiLevelType w:val="multilevel"/>
+    <w:tmpl w:val="381CDEA6"/>
+    <w:lvl w:ilvl="0">
+      <w:start w:val="1"/>
+      <w:numFmt w:val="bullet"/>
+      <w:lvlText w:val=""/>
+      <w:lvlJc w:val="left"/>
+      <w:pPr>
+        <w:tabs>
+          <w:tab w:val="num" w:pos="720"/>
+        </w:tabs>
+        <w:ind w:left="720" w:hanging="360"/>
+      </w:pPr>
+      <w:rPr>
+        <w:rFonts w:ascii="Symbol" w:hAnsi="Symbol" w:hint="default"/>
+        <w:sz w:val="20"/>
+      </w:rPr>
+    </w:lvl>
+    <w:lvl w:ilvl="1" w:tentative="1">
+      <w:start w:val="1"/>
+      <w:numFmt w:val="bullet"/>
+      <w:lvlText w:val="o"/>
+      <w:lvlJc w:val="left"/>
+      <w:pPr>
+        <w:tabs>
+          <w:tab w:val="num" w:pos="1440"/>
+        </w:tabs>
+        <w:ind w:left="1440" w:hanging="360"/>
+      </w:pPr>
+      <w:rPr>
+        <w:rFonts w:ascii="Courier New" w:hAnsi="Courier New" w:hint="default"/>
+        <w:sz w:val="20"/>
+      </w:rPr>
+    </w:lvl>
+    <w:lvl w:ilvl="2" w:tentative="1">
+      <w:start w:val="1"/>
+      <w:numFmt w:val="bullet"/>
+      <w:lvlText w:val=""/>
+      <w:lvlJc w:val="left"/>
+      <w:pPr>
+        <w:tabs>
+          <w:tab w:val="num" w:pos="2160"/>
+        </w:tabs>
+        <w:ind w:left="2160" w:hanging="360"/>
+      </w:pPr>
+      <w:rPr>
+        <w:rFonts w:ascii="Wingdings" w:hAnsi="Wingdings" w:hint="default"/>
+        <w:sz w:val="20"/>
+      </w:rPr>
+    </w:lvl>
+    <w:lvl w:ilvl="3" w:tentative="1">
+      <w:start w:val="1"/>
+      <w:numFmt w:val="bullet"/>
+      <w:lvlText w:val=""/>
+      <w:lvlJc w:val="left"/>
+      <w:pPr>
+        <w:tabs>
+          <w:tab w:val="num" w:pos="2880"/>
+        </w:tabs>
+        <w:ind w:left="2880" w:hanging="360"/>
+      </w:pPr>
+      <w:rPr>
+        <w:rFonts w:ascii="Wingdings" w:hAnsi="Wingdings" w:hint="default"/>
+        <w:sz w:val="20"/>
+      </w:rPr>
+    </w:lvl>
+    <w:lvl w:ilvl="4" w:tentative="1">
+      <w:start w:val="1"/>
+      <w:numFmt w:val="bullet"/>
+      <w:lvlText w:val=""/>
+      <w:lvlJc w:val="left"/>
+      <w:pPr>
+        <w:tabs>
+          <w:tab w:val="num" w:pos="3600"/>
+        </w:tabs>
+        <w:ind w:left="3600" w:hanging="360"/>
+      </w:pPr>
+      <w:rPr>
+        <w:rFonts w:ascii="Wingdings" w:hAnsi="Wingdings" w:hint="default"/>
+        <w:sz w:val="20"/>
+      </w:rPr>
+    </w:lvl>
+    <w:lvl w:ilvl="5" w:tentative="1">
+      <w:start w:val="1"/>
+      <w:numFmt w:val="bullet"/>
+      <w:lvlText w:val=""/>
+      <w:lvlJc w:val="left"/>
+      <w:pPr>
+        <w:tabs>
+          <w:tab w:val="num" w:pos="4320"/>
+        </w:tabs>
+        <w:ind w:left="4320" w:hanging="360"/>
+      </w:pPr>
+      <w:rPr>
+        <w:rFonts w:ascii="Wingdings" w:hAnsi="Wingdings" w:hint="default"/>
+        <w:sz w:val="20"/>
+      </w:rPr>
+    </w:lvl>
+    <w:lvl w:ilvl="6" w:tentative="1">
+      <w:start w:val="1"/>
+      <w:numFmt w:val="bullet"/>
+      <w:lvlText w:val=""/>
+      <w:lvlJc w:val="left"/>
+      <w:pPr>
+        <w:tabs>
+          <w:tab w:val="num" w:pos="5040"/>
+        </w:tabs>
+        <w:ind w:left="5040" w:hanging="360"/>
+      </w:pPr>
+      <w:rPr>
+        <w:rFonts w:ascii="Wingdings" w:hAnsi="Wingdings" w:hint="default"/>
+        <w:sz w:val="20"/>
+      </w:rPr>
+    </w:lvl>
+    <w:lvl w:ilvl="7" w:tentative="1">
+      <w:start w:val="1"/>
+      <w:numFmt w:val="bullet"/>
+      <w:lvlText w:val=""/>
+      <w:lvlJc w:val="left"/>
+      <w:pPr>
+        <w:tabs>
+          <w:tab w:val="num" w:pos="5760"/>
+        </w:tabs>
+        <w:ind w:left="5760" w:hanging="360"/>
+      </w:pPr>
+      <w:rPr>
+        <w:rFonts w:ascii="Wingdings" w:hAnsi="Wingdings" w:hint="default"/>
+        <w:sz w:val="20"/>
+      </w:rPr>
+    </w:lvl>
+    <w:lvl w:ilvl="8" w:tentative="1">
+      <w:start w:val="1"/>
+      <w:numFmt w:val="bullet"/>
+      <w:lvlText w:val=""/>
+      <w:lvlJc w:val="left"/>
+      <w:pPr>
+        <w:tabs>
+          <w:tab w:val="num" w:pos="6480"/>
+        </w:tabs>
+        <w:ind w:left="6480" w:hanging="360"/>
+      </w:pPr>
+      <w:rPr>
+        <w:rFonts w:ascii="Wingdings" w:hAnsi="Wingdings" w:hint="default"/>
+        <w:sz w:val="20"/>
+      </w:rPr>
+    </w:lvl>
+  </w:abstractNum>
+  <w:abstractNum w:abstractNumId="2" w15:restartNumberingAfterBreak="0">
     <w:nsid w:val="0744611E"/>
     <w:multiLevelType w:val="multilevel"/>
     <w:tmpl w:val="ECE6E6B2"/>
@@ -1808,7 +2660,120 @@
       </w:rPr>
     </w:lvl>
   </w:abstractNum>
-  <w:abstractNum w:abstractNumId="2" w15:restartNumberingAfterBreak="0">
+  <w:abstractNum w:abstractNumId="3" w15:restartNumberingAfterBreak="0">
+    <w:nsid w:val="07656894"/>
+    <w:multiLevelType w:val="multilevel"/>
+    <w:tmpl w:val="6BDE8652"/>
+    <w:lvl w:ilvl="0">
+      <w:start w:val="1"/>
+      <w:numFmt w:val="decimal"/>
+      <w:lvlText w:val="%1."/>
+      <w:lvlJc w:val="left"/>
+      <w:pPr>
+        <w:tabs>
+          <w:tab w:val="num" w:pos="720"/>
+        </w:tabs>
+        <w:ind w:left="720" w:hanging="360"/>
+      </w:pPr>
+    </w:lvl>
+    <w:lvl w:ilvl="1" w:tentative="1">
+      <w:start w:val="1"/>
+      <w:numFmt w:val="decimal"/>
+      <w:lvlText w:val="%2."/>
+      <w:lvlJc w:val="left"/>
+      <w:pPr>
+        <w:tabs>
+          <w:tab w:val="num" w:pos="1440"/>
+        </w:tabs>
+        <w:ind w:left="1440" w:hanging="360"/>
+      </w:pPr>
+    </w:lvl>
+    <w:lvl w:ilvl="2" w:tentative="1">
+      <w:start w:val="1"/>
+      <w:numFmt w:val="decimal"/>
+      <w:lvlText w:val="%3."/>
+      <w:lvlJc w:val="left"/>
+      <w:pPr>
+        <w:tabs>
+          <w:tab w:val="num" w:pos="2160"/>
+        </w:tabs>
+        <w:ind w:left="2160" w:hanging="360"/>
+      </w:pPr>
+    </w:lvl>
+    <w:lvl w:ilvl="3" w:tentative="1">
+      <w:start w:val="1"/>
+      <w:numFmt w:val="decimal"/>
+      <w:lvlText w:val="%4."/>
+      <w:lvlJc w:val="left"/>
+      <w:pPr>
+        <w:tabs>
+          <w:tab w:val="num" w:pos="2880"/>
+        </w:tabs>
+        <w:ind w:left="2880" w:hanging="360"/>
+      </w:pPr>
+    </w:lvl>
+    <w:lvl w:ilvl="4" w:tentative="1">
+      <w:start w:val="1"/>
+      <w:numFmt w:val="decimal"/>
+      <w:lvlText w:val="%5."/>
+      <w:lvlJc w:val="left"/>
+      <w:pPr>
+        <w:tabs>
+          <w:tab w:val="num" w:pos="3600"/>
+        </w:tabs>
+        <w:ind w:left="3600" w:hanging="360"/>
+      </w:pPr>
+    </w:lvl>
+    <w:lvl w:ilvl="5" w:tentative="1">
+      <w:start w:val="1"/>
+      <w:numFmt w:val="decimal"/>
+      <w:lvlText w:val="%6."/>
+      <w:lvlJc w:val="left"/>
+      <w:pPr>
+        <w:tabs>
+          <w:tab w:val="num" w:pos="4320"/>
+        </w:tabs>
+        <w:ind w:left="4320" w:hanging="360"/>
+      </w:pPr>
+    </w:lvl>
+    <w:lvl w:ilvl="6" w:tentative="1">
+      <w:start w:val="1"/>
+      <w:numFmt w:val="decimal"/>
+      <w:lvlText w:val="%7."/>
+      <w:lvlJc w:val="left"/>
+      <w:pPr>
+        <w:tabs>
+          <w:tab w:val="num" w:pos="5040"/>
+        </w:tabs>
+        <w:ind w:left="5040" w:hanging="360"/>
+      </w:pPr>
+    </w:lvl>
+    <w:lvl w:ilvl="7" w:tentative="1">
+      <w:start w:val="1"/>
+      <w:numFmt w:val="decimal"/>
+      <w:lvlText w:val="%8."/>
+      <w:lvlJc w:val="left"/>
+      <w:pPr>
+        <w:tabs>
+          <w:tab w:val="num" w:pos="5760"/>
+        </w:tabs>
+        <w:ind w:left="5760" w:hanging="360"/>
+      </w:pPr>
+    </w:lvl>
+    <w:lvl w:ilvl="8" w:tentative="1">
+      <w:start w:val="1"/>
+      <w:numFmt w:val="decimal"/>
+      <w:lvlText w:val="%9."/>
+      <w:lvlJc w:val="left"/>
+      <w:pPr>
+        <w:tabs>
+          <w:tab w:val="num" w:pos="6480"/>
+        </w:tabs>
+        <w:ind w:left="6480" w:hanging="360"/>
+      </w:pPr>
+    </w:lvl>
+  </w:abstractNum>
+  <w:abstractNum w:abstractNumId="4" w15:restartNumberingAfterBreak="0">
     <w:nsid w:val="13F30B42"/>
     <w:multiLevelType w:val="multilevel"/>
     <w:tmpl w:val="3118DE14"/>
@@ -1925,7 +2890,7 @@
       </w:pPr>
     </w:lvl>
   </w:abstractNum>
-  <w:abstractNum w:abstractNumId="3" w15:restartNumberingAfterBreak="0">
+  <w:abstractNum w:abstractNumId="5" w15:restartNumberingAfterBreak="0">
     <w:nsid w:val="1AEB5350"/>
     <w:multiLevelType w:val="multilevel"/>
     <w:tmpl w:val="DC2E671A"/>
@@ -2074,7 +3039,156 @@
       </w:rPr>
     </w:lvl>
   </w:abstractNum>
-  <w:abstractNum w:abstractNumId="4" w15:restartNumberingAfterBreak="0">
+  <w:abstractNum w:abstractNumId="6" w15:restartNumberingAfterBreak="0">
+    <w:nsid w:val="224F7BEE"/>
+    <w:multiLevelType w:val="multilevel"/>
+    <w:tmpl w:val="76564E3C"/>
+    <w:lvl w:ilvl="0">
+      <w:start w:val="1"/>
+      <w:numFmt w:val="bullet"/>
+      <w:lvlText w:val=""/>
+      <w:lvlJc w:val="left"/>
+      <w:pPr>
+        <w:tabs>
+          <w:tab w:val="num" w:pos="720"/>
+        </w:tabs>
+        <w:ind w:left="720" w:hanging="360"/>
+      </w:pPr>
+      <w:rPr>
+        <w:rFonts w:ascii="Symbol" w:hAnsi="Symbol" w:hint="default"/>
+        <w:sz w:val="20"/>
+      </w:rPr>
+    </w:lvl>
+    <w:lvl w:ilvl="1" w:tentative="1">
+      <w:start w:val="1"/>
+      <w:numFmt w:val="bullet"/>
+      <w:lvlText w:val="o"/>
+      <w:lvlJc w:val="left"/>
+      <w:pPr>
+        <w:tabs>
+          <w:tab w:val="num" w:pos="1440"/>
+        </w:tabs>
+        <w:ind w:left="1440" w:hanging="360"/>
+      </w:pPr>
+      <w:rPr>
+        <w:rFonts w:ascii="Courier New" w:hAnsi="Courier New" w:hint="default"/>
+        <w:sz w:val="20"/>
+      </w:rPr>
+    </w:lvl>
+    <w:lvl w:ilvl="2" w:tentative="1">
+      <w:start w:val="1"/>
+      <w:numFmt w:val="bullet"/>
+      <w:lvlText w:val=""/>
+      <w:lvlJc w:val="left"/>
+      <w:pPr>
+        <w:tabs>
+          <w:tab w:val="num" w:pos="2160"/>
+        </w:tabs>
+        <w:ind w:left="2160" w:hanging="360"/>
+      </w:pPr>
+      <w:rPr>
+        <w:rFonts w:ascii="Wingdings" w:hAnsi="Wingdings" w:hint="default"/>
+        <w:sz w:val="20"/>
+      </w:rPr>
+    </w:lvl>
+    <w:lvl w:ilvl="3" w:tentative="1">
+      <w:start w:val="1"/>
+      <w:numFmt w:val="bullet"/>
+      <w:lvlText w:val=""/>
+      <w:lvlJc w:val="left"/>
+      <w:pPr>
+        <w:tabs>
+          <w:tab w:val="num" w:pos="2880"/>
+        </w:tabs>
+        <w:ind w:left="2880" w:hanging="360"/>
+      </w:pPr>
+      <w:rPr>
+        <w:rFonts w:ascii="Wingdings" w:hAnsi="Wingdings" w:hint="default"/>
+        <w:sz w:val="20"/>
+      </w:rPr>
+    </w:lvl>
+    <w:lvl w:ilvl="4" w:tentative="1">
+      <w:start w:val="1"/>
+      <w:numFmt w:val="bullet"/>
+      <w:lvlText w:val=""/>
+      <w:lvlJc w:val="left"/>
+      <w:pPr>
+        <w:tabs>
+          <w:tab w:val="num" w:pos="3600"/>
+        </w:tabs>
+        <w:ind w:left="3600" w:hanging="360"/>
+      </w:pPr>
+      <w:rPr>
+        <w:rFonts w:ascii="Wingdings" w:hAnsi="Wingdings" w:hint="default"/>
+        <w:sz w:val="20"/>
+      </w:rPr>
+    </w:lvl>
+    <w:lvl w:ilvl="5" w:tentative="1">
+      <w:start w:val="1"/>
+      <w:numFmt w:val="bullet"/>
+      <w:lvlText w:val=""/>
+      <w:lvlJc w:val="left"/>
+      <w:pPr>
+        <w:tabs>
+          <w:tab w:val="num" w:pos="4320"/>
+        </w:tabs>
+        <w:ind w:left="4320" w:hanging="360"/>
+      </w:pPr>
+      <w:rPr>
+        <w:rFonts w:ascii="Wingdings" w:hAnsi="Wingdings" w:hint="default"/>
+        <w:sz w:val="20"/>
+      </w:rPr>
+    </w:lvl>
+    <w:lvl w:ilvl="6" w:tentative="1">
+      <w:start w:val="1"/>
+      <w:numFmt w:val="bullet"/>
+      <w:lvlText w:val=""/>
+      <w:lvlJc w:val="left"/>
+      <w:pPr>
+        <w:tabs>
+          <w:tab w:val="num" w:pos="5040"/>
+        </w:tabs>
+        <w:ind w:left="5040" w:hanging="360"/>
+      </w:pPr>
+      <w:rPr>
+        <w:rFonts w:ascii="Wingdings" w:hAnsi="Wingdings" w:hint="default"/>
+        <w:sz w:val="20"/>
+      </w:rPr>
+    </w:lvl>
+    <w:lvl w:ilvl="7" w:tentative="1">
+      <w:start w:val="1"/>
+      <w:numFmt w:val="bullet"/>
+      <w:lvlText w:val=""/>
+      <w:lvlJc w:val="left"/>
+      <w:pPr>
+        <w:tabs>
+          <w:tab w:val="num" w:pos="5760"/>
+        </w:tabs>
+        <w:ind w:left="5760" w:hanging="360"/>
+      </w:pPr>
+      <w:rPr>
+        <w:rFonts w:ascii="Wingdings" w:hAnsi="Wingdings" w:hint="default"/>
+        <w:sz w:val="20"/>
+      </w:rPr>
+    </w:lvl>
+    <w:lvl w:ilvl="8" w:tentative="1">
+      <w:start w:val="1"/>
+      <w:numFmt w:val="bullet"/>
+      <w:lvlText w:val=""/>
+      <w:lvlJc w:val="left"/>
+      <w:pPr>
+        <w:tabs>
+          <w:tab w:val="num" w:pos="6480"/>
+        </w:tabs>
+        <w:ind w:left="6480" w:hanging="360"/>
+      </w:pPr>
+      <w:rPr>
+        <w:rFonts w:ascii="Wingdings" w:hAnsi="Wingdings" w:hint="default"/>
+        <w:sz w:val="20"/>
+      </w:rPr>
+    </w:lvl>
+  </w:abstractNum>
+  <w:abstractNum w:abstractNumId="7" w15:restartNumberingAfterBreak="0">
     <w:nsid w:val="2C5E3E08"/>
     <w:multiLevelType w:val="multilevel"/>
     <w:tmpl w:val="019AA974"/>
@@ -2223,7 +3337,305 @@
       </w:rPr>
     </w:lvl>
   </w:abstractNum>
-  <w:abstractNum w:abstractNumId="5" w15:restartNumberingAfterBreak="0">
+  <w:abstractNum w:abstractNumId="8" w15:restartNumberingAfterBreak="0">
+    <w:nsid w:val="38FC6C80"/>
+    <w:multiLevelType w:val="multilevel"/>
+    <w:tmpl w:val="8C1EF6BC"/>
+    <w:lvl w:ilvl="0">
+      <w:start w:val="1"/>
+      <w:numFmt w:val="bullet"/>
+      <w:lvlText w:val=""/>
+      <w:lvlJc w:val="left"/>
+      <w:pPr>
+        <w:tabs>
+          <w:tab w:val="num" w:pos="720"/>
+        </w:tabs>
+        <w:ind w:left="720" w:hanging="360"/>
+      </w:pPr>
+      <w:rPr>
+        <w:rFonts w:ascii="Symbol" w:hAnsi="Symbol" w:hint="default"/>
+        <w:sz w:val="20"/>
+      </w:rPr>
+    </w:lvl>
+    <w:lvl w:ilvl="1" w:tentative="1">
+      <w:start w:val="1"/>
+      <w:numFmt w:val="bullet"/>
+      <w:lvlText w:val="o"/>
+      <w:lvlJc w:val="left"/>
+      <w:pPr>
+        <w:tabs>
+          <w:tab w:val="num" w:pos="1440"/>
+        </w:tabs>
+        <w:ind w:left="1440" w:hanging="360"/>
+      </w:pPr>
+      <w:rPr>
+        <w:rFonts w:ascii="Courier New" w:hAnsi="Courier New" w:hint="default"/>
+        <w:sz w:val="20"/>
+      </w:rPr>
+    </w:lvl>
+    <w:lvl w:ilvl="2" w:tentative="1">
+      <w:start w:val="1"/>
+      <w:numFmt w:val="bullet"/>
+      <w:lvlText w:val=""/>
+      <w:lvlJc w:val="left"/>
+      <w:pPr>
+        <w:tabs>
+          <w:tab w:val="num" w:pos="2160"/>
+        </w:tabs>
+        <w:ind w:left="2160" w:hanging="360"/>
+      </w:pPr>
+      <w:rPr>
+        <w:rFonts w:ascii="Wingdings" w:hAnsi="Wingdings" w:hint="default"/>
+        <w:sz w:val="20"/>
+      </w:rPr>
+    </w:lvl>
+    <w:lvl w:ilvl="3" w:tentative="1">
+      <w:start w:val="1"/>
+      <w:numFmt w:val="bullet"/>
+      <w:lvlText w:val=""/>
+      <w:lvlJc w:val="left"/>
+      <w:pPr>
+        <w:tabs>
+          <w:tab w:val="num" w:pos="2880"/>
+        </w:tabs>
+        <w:ind w:left="2880" w:hanging="360"/>
+      </w:pPr>
+      <w:rPr>
+        <w:rFonts w:ascii="Wingdings" w:hAnsi="Wingdings" w:hint="default"/>
+        <w:sz w:val="20"/>
+      </w:rPr>
+    </w:lvl>
+    <w:lvl w:ilvl="4" w:tentative="1">
+      <w:start w:val="1"/>
+      <w:numFmt w:val="bullet"/>
+      <w:lvlText w:val=""/>
+      <w:lvlJc w:val="left"/>
+      <w:pPr>
+        <w:tabs>
+          <w:tab w:val="num" w:pos="3600"/>
+        </w:tabs>
+        <w:ind w:left="3600" w:hanging="360"/>
+      </w:pPr>
+      <w:rPr>
+        <w:rFonts w:ascii="Wingdings" w:hAnsi="Wingdings" w:hint="default"/>
+        <w:sz w:val="20"/>
+      </w:rPr>
+    </w:lvl>
+    <w:lvl w:ilvl="5" w:tentative="1">
+      <w:start w:val="1"/>
+      <w:numFmt w:val="bullet"/>
+      <w:lvlText w:val=""/>
+      <w:lvlJc w:val="left"/>
+      <w:pPr>
+        <w:tabs>
+          <w:tab w:val="num" w:pos="4320"/>
+        </w:tabs>
+        <w:ind w:left="4320" w:hanging="360"/>
+      </w:pPr>
+      <w:rPr>
+        <w:rFonts w:ascii="Wingdings" w:hAnsi="Wingdings" w:hint="default"/>
+        <w:sz w:val="20"/>
+      </w:rPr>
+    </w:lvl>
+    <w:lvl w:ilvl="6" w:tentative="1">
+      <w:start w:val="1"/>
+      <w:numFmt w:val="bullet"/>
+      <w:lvlText w:val=""/>
+      <w:lvlJc w:val="left"/>
+      <w:pPr>
+        <w:tabs>
+          <w:tab w:val="num" w:pos="5040"/>
+        </w:tabs>
+        <w:ind w:left="5040" w:hanging="360"/>
+      </w:pPr>
+      <w:rPr>
+        <w:rFonts w:ascii="Wingdings" w:hAnsi="Wingdings" w:hint="default"/>
+        <w:sz w:val="20"/>
+      </w:rPr>
+    </w:lvl>
+    <w:lvl w:ilvl="7" w:tentative="1">
+      <w:start w:val="1"/>
+      <w:numFmt w:val="bullet"/>
+      <w:lvlText w:val=""/>
+      <w:lvlJc w:val="left"/>
+      <w:pPr>
+        <w:tabs>
+          <w:tab w:val="num" w:pos="5760"/>
+        </w:tabs>
+        <w:ind w:left="5760" w:hanging="360"/>
+      </w:pPr>
+      <w:rPr>
+        <w:rFonts w:ascii="Wingdings" w:hAnsi="Wingdings" w:hint="default"/>
+        <w:sz w:val="20"/>
+      </w:rPr>
+    </w:lvl>
+    <w:lvl w:ilvl="8" w:tentative="1">
+      <w:start w:val="1"/>
+      <w:numFmt w:val="bullet"/>
+      <w:lvlText w:val=""/>
+      <w:lvlJc w:val="left"/>
+      <w:pPr>
+        <w:tabs>
+          <w:tab w:val="num" w:pos="6480"/>
+        </w:tabs>
+        <w:ind w:left="6480" w:hanging="360"/>
+      </w:pPr>
+      <w:rPr>
+        <w:rFonts w:ascii="Wingdings" w:hAnsi="Wingdings" w:hint="default"/>
+        <w:sz w:val="20"/>
+      </w:rPr>
+    </w:lvl>
+  </w:abstractNum>
+  <w:abstractNum w:abstractNumId="9" w15:restartNumberingAfterBreak="0">
+    <w:nsid w:val="3AB452B8"/>
+    <w:multiLevelType w:val="multilevel"/>
+    <w:tmpl w:val="4E86D676"/>
+    <w:lvl w:ilvl="0">
+      <w:start w:val="1"/>
+      <w:numFmt w:val="bullet"/>
+      <w:lvlText w:val=""/>
+      <w:lvlJc w:val="left"/>
+      <w:pPr>
+        <w:tabs>
+          <w:tab w:val="num" w:pos="720"/>
+        </w:tabs>
+        <w:ind w:left="720" w:hanging="360"/>
+      </w:pPr>
+      <w:rPr>
+        <w:rFonts w:ascii="Symbol" w:hAnsi="Symbol" w:hint="default"/>
+        <w:sz w:val="20"/>
+      </w:rPr>
+    </w:lvl>
+    <w:lvl w:ilvl="1" w:tentative="1">
+      <w:start w:val="1"/>
+      <w:numFmt w:val="bullet"/>
+      <w:lvlText w:val="o"/>
+      <w:lvlJc w:val="left"/>
+      <w:pPr>
+        <w:tabs>
+          <w:tab w:val="num" w:pos="1440"/>
+        </w:tabs>
+        <w:ind w:left="1440" w:hanging="360"/>
+      </w:pPr>
+      <w:rPr>
+        <w:rFonts w:ascii="Courier New" w:hAnsi="Courier New" w:hint="default"/>
+        <w:sz w:val="20"/>
+      </w:rPr>
+    </w:lvl>
+    <w:lvl w:ilvl="2" w:tentative="1">
+      <w:start w:val="1"/>
+      <w:numFmt w:val="bullet"/>
+      <w:lvlText w:val=""/>
+      <w:lvlJc w:val="left"/>
+      <w:pPr>
+        <w:tabs>
+          <w:tab w:val="num" w:pos="2160"/>
+        </w:tabs>
+        <w:ind w:left="2160" w:hanging="360"/>
+      </w:pPr>
+      <w:rPr>
+        <w:rFonts w:ascii="Wingdings" w:hAnsi="Wingdings" w:hint="default"/>
+        <w:sz w:val="20"/>
+      </w:rPr>
+    </w:lvl>
+    <w:lvl w:ilvl="3" w:tentative="1">
+      <w:start w:val="1"/>
+      <w:numFmt w:val="bullet"/>
+      <w:lvlText w:val=""/>
+      <w:lvlJc w:val="left"/>
+      <w:pPr>
+        <w:tabs>
+          <w:tab w:val="num" w:pos="2880"/>
+        </w:tabs>
+        <w:ind w:left="2880" w:hanging="360"/>
+      </w:pPr>
+      <w:rPr>
+        <w:rFonts w:ascii="Wingdings" w:hAnsi="Wingdings" w:hint="default"/>
+        <w:sz w:val="20"/>
+      </w:rPr>
+    </w:lvl>
+    <w:lvl w:ilvl="4" w:tentative="1">
+      <w:start w:val="1"/>
+      <w:numFmt w:val="bullet"/>
+      <w:lvlText w:val=""/>
+      <w:lvlJc w:val="left"/>
+      <w:pPr>
+        <w:tabs>
+          <w:tab w:val="num" w:pos="3600"/>
+        </w:tabs>
+        <w:ind w:left="3600" w:hanging="360"/>
+      </w:pPr>
+      <w:rPr>
+        <w:rFonts w:ascii="Wingdings" w:hAnsi="Wingdings" w:hint="default"/>
+        <w:sz w:val="20"/>
+      </w:rPr>
+    </w:lvl>
+    <w:lvl w:ilvl="5" w:tentative="1">
+      <w:start w:val="1"/>
+      <w:numFmt w:val="bullet"/>
+      <w:lvlText w:val=""/>
+      <w:lvlJc w:val="left"/>
+      <w:pPr>
+        <w:tabs>
+          <w:tab w:val="num" w:pos="4320"/>
+        </w:tabs>
+        <w:ind w:left="4320" w:hanging="360"/>
+      </w:pPr>
+      <w:rPr>
+        <w:rFonts w:ascii="Wingdings" w:hAnsi="Wingdings" w:hint="default"/>
+        <w:sz w:val="20"/>
+      </w:rPr>
+    </w:lvl>
+    <w:lvl w:ilvl="6" w:tentative="1">
+      <w:start w:val="1"/>
+      <w:numFmt w:val="bullet"/>
+      <w:lvlText w:val=""/>
+      <w:lvlJc w:val="left"/>
+      <w:pPr>
+        <w:tabs>
+          <w:tab w:val="num" w:pos="5040"/>
+        </w:tabs>
+        <w:ind w:left="5040" w:hanging="360"/>
+      </w:pPr>
+      <w:rPr>
+        <w:rFonts w:ascii="Wingdings" w:hAnsi="Wingdings" w:hint="default"/>
+        <w:sz w:val="20"/>
+      </w:rPr>
+    </w:lvl>
+    <w:lvl w:ilvl="7" w:tentative="1">
+      <w:start w:val="1"/>
+      <w:numFmt w:val="bullet"/>
+      <w:lvlText w:val=""/>
+      <w:lvlJc w:val="left"/>
+      <w:pPr>
+        <w:tabs>
+          <w:tab w:val="num" w:pos="5760"/>
+        </w:tabs>
+        <w:ind w:left="5760" w:hanging="360"/>
+      </w:pPr>
+      <w:rPr>
+        <w:rFonts w:ascii="Wingdings" w:hAnsi="Wingdings" w:hint="default"/>
+        <w:sz w:val="20"/>
+      </w:rPr>
+    </w:lvl>
+    <w:lvl w:ilvl="8" w:tentative="1">
+      <w:start w:val="1"/>
+      <w:numFmt w:val="bullet"/>
+      <w:lvlText w:val=""/>
+      <w:lvlJc w:val="left"/>
+      <w:pPr>
+        <w:tabs>
+          <w:tab w:val="num" w:pos="6480"/>
+        </w:tabs>
+        <w:ind w:left="6480" w:hanging="360"/>
+      </w:pPr>
+      <w:rPr>
+        <w:rFonts w:ascii="Wingdings" w:hAnsi="Wingdings" w:hint="default"/>
+        <w:sz w:val="20"/>
+      </w:rPr>
+    </w:lvl>
+  </w:abstractNum>
+  <w:abstractNum w:abstractNumId="10" w15:restartNumberingAfterBreak="0">
     <w:nsid w:val="51130B7E"/>
     <w:multiLevelType w:val="multilevel"/>
     <w:tmpl w:val="4AC0366A"/>
@@ -2372,7 +3784,7 @@
       </w:rPr>
     </w:lvl>
   </w:abstractNum>
-  <w:abstractNum w:abstractNumId="6" w15:restartNumberingAfterBreak="0">
+  <w:abstractNum w:abstractNumId="11" w15:restartNumberingAfterBreak="0">
     <w:nsid w:val="62CD2139"/>
     <w:multiLevelType w:val="multilevel"/>
     <w:tmpl w:val="6AD6F7E4"/>
@@ -2521,7 +3933,7 @@
       </w:rPr>
     </w:lvl>
   </w:abstractNum>
-  <w:abstractNum w:abstractNumId="7" w15:restartNumberingAfterBreak="0">
+  <w:abstractNum w:abstractNumId="12" w15:restartNumberingAfterBreak="0">
     <w:nsid w:val="6A5510BA"/>
     <w:multiLevelType w:val="multilevel"/>
     <w:tmpl w:val="D6EC94CE"/>
@@ -2634,7 +4046,7 @@
       </w:pPr>
     </w:lvl>
   </w:abstractNum>
-  <w:abstractNum w:abstractNumId="8" w15:restartNumberingAfterBreak="0">
+  <w:abstractNum w:abstractNumId="13" w15:restartNumberingAfterBreak="0">
     <w:nsid w:val="6A5762E5"/>
     <w:multiLevelType w:val="multilevel"/>
     <w:tmpl w:val="5CCC9630"/>
@@ -2747,7 +4159,7 @@
       </w:pPr>
     </w:lvl>
   </w:abstractNum>
-  <w:abstractNum w:abstractNumId="9" w15:restartNumberingAfterBreak="0">
+  <w:abstractNum w:abstractNumId="14" w15:restartNumberingAfterBreak="0">
     <w:nsid w:val="72600B16"/>
     <w:multiLevelType w:val="multilevel"/>
     <w:tmpl w:val="0096CD3E"/>
@@ -2896,7 +4308,7 @@
       </w:rPr>
     </w:lvl>
   </w:abstractNum>
-  <w:abstractNum w:abstractNumId="10" w15:restartNumberingAfterBreak="0">
+  <w:abstractNum w:abstractNumId="15" w15:restartNumberingAfterBreak="0">
     <w:nsid w:val="779C6D48"/>
     <w:multiLevelType w:val="multilevel"/>
     <w:tmpl w:val="54968370"/>
@@ -3046,37 +4458,52 @@
     </w:lvl>
   </w:abstractNum>
   <w:num w:numId="1" w16cid:durableId="1743216619">
+    <w:abstractNumId w:val="15"/>
+  </w:num>
+  <w:num w:numId="2" w16cid:durableId="1910386366">
+    <w:abstractNumId w:val="2"/>
+  </w:num>
+  <w:num w:numId="3" w16cid:durableId="876087748">
+    <w:abstractNumId w:val="11"/>
+  </w:num>
+  <w:num w:numId="4" w16cid:durableId="1746340681">
     <w:abstractNumId w:val="10"/>
   </w:num>
-  <w:num w:numId="2" w16cid:durableId="1910386366">
-    <w:abstractNumId w:val="1"/>
-  </w:num>
-  <w:num w:numId="3" w16cid:durableId="876087748">
-    <w:abstractNumId w:val="6"/>
-  </w:num>
-  <w:num w:numId="4" w16cid:durableId="1746340681">
-    <w:abstractNumId w:val="5"/>
-  </w:num>
   <w:num w:numId="5" w16cid:durableId="946930896">
-    <w:abstractNumId w:val="4"/>
+    <w:abstractNumId w:val="7"/>
   </w:num>
   <w:num w:numId="6" w16cid:durableId="1701664346">
     <w:abstractNumId w:val="0"/>
   </w:num>
   <w:num w:numId="7" w16cid:durableId="1451776826">
+    <w:abstractNumId w:val="5"/>
+  </w:num>
+  <w:num w:numId="8" w16cid:durableId="555090215">
+    <w:abstractNumId w:val="4"/>
+  </w:num>
+  <w:num w:numId="9" w16cid:durableId="213664877">
+    <w:abstractNumId w:val="13"/>
+  </w:num>
+  <w:num w:numId="10" w16cid:durableId="501628521">
+    <w:abstractNumId w:val="12"/>
+  </w:num>
+  <w:num w:numId="11" w16cid:durableId="1091858077">
+    <w:abstractNumId w:val="14"/>
+  </w:num>
+  <w:num w:numId="12" w16cid:durableId="102263613">
+    <w:abstractNumId w:val="8"/>
+  </w:num>
+  <w:num w:numId="13" w16cid:durableId="175928080">
+    <w:abstractNumId w:val="9"/>
+  </w:num>
+  <w:num w:numId="14" w16cid:durableId="1239361673">
     <w:abstractNumId w:val="3"/>
   </w:num>
-  <w:num w:numId="8" w16cid:durableId="555090215">
-    <w:abstractNumId w:val="2"/>
+  <w:num w:numId="15" w16cid:durableId="1867979660">
+    <w:abstractNumId w:val="6"/>
   </w:num>
-  <w:num w:numId="9" w16cid:durableId="213664877">
-    <w:abstractNumId w:val="8"/>
-  </w:num>
-  <w:num w:numId="10" w16cid:durableId="501628521">
-    <w:abstractNumId w:val="7"/>
-  </w:num>
-  <w:num w:numId="11" w16cid:durableId="1091858077">
-    <w:abstractNumId w:val="9"/>
+  <w:num w:numId="16" w16cid:durableId="251746988">
+    <w:abstractNumId w:val="1"/>
   </w:num>
 </w:numbering>
 </file>

</xml_diff>